<commit_message>
docs: atualiza todos os documentos depois da validação
- Checklist: itens aprovados passam a feito e validado
- PlanoDeTeste: objetivo, escopo, estratégia, ambiente, critérios,
  situação, riscos e procedimento no modelo enxuto; seções antigas
  marcadas como histórico
- DocumentacaoFinal: novo registro 20 (Oxide enxuta e envio ao Supabase)
  e registro 19 atualizado com as respostas recebidas
- Contrato de entrega e Desenvolvimento: pequenos acertos

Co-Authored-By: Claude Opus 5.5 <noreply@anthropic.com>
</commit_message>
<xml_diff>
--- a/DocumentacaoFinal/INTEGRA_2026_Entrega_7_19_Revisao_da_Arquitetura_Supabase.docx
+++ b/DocumentacaoFinal/INTEGRA_2026_Entrega_7_19_Revisao_da_Arquitetura_Supabase.docx
@@ -883,7 +883,7 @@
                 <w:szCs w:val="17"/>
                 <w:lang w:val="pt-BR"/>
               </w:rPr>
-              <w:t xml:space="preserve">Natã da Silva Baracho revisou a proposta e o texto e encaminhou o resumo e as perguntas ao professor Alisson. As respostas estão pendentes.</w:t>
+              <w:t xml:space="preserve">Natã da Silva Baracho revisou a proposta e o texto e encaminhou o resumo e as perguntas ao professor Alisson. As respostas vieram em 10/10/2026: o Supabase é o banco principal; envio pela API REST, por uma função de recebimento; fila mínima na Oxide; rotas do lacre mantidas; posição e bateria obrigatórias; comandos e cadastro de dispositivos no Supabase. Com elas, Natã autorizou o início da implementação (registro 20).</w:t>
             </w:r>
           </w:p>
         </w:tc>
@@ -1017,7 +1017,7 @@
                 <w:szCs w:val="17"/>
                 <w:lang w:val="pt-BR"/>
               </w:rPr>
-              <w:t xml:space="preserve">Justificativa: o resumo e as perguntas foram enviados como estavam; a implementação aguarda as respostas.</w:t>
+              <w:t xml:space="preserve">Justificativa: o resumo e as perguntas foram enviados como estavam, e as respostas orientaram a implementação seguinte.</w:t>
             </w:r>
           </w:p>
         </w:tc>
@@ -1094,7 +1094,7 @@
                 <w:szCs w:val="17"/>
                 <w:lang w:val="pt-BR"/>
               </w:rPr>
-              <w:t xml:space="preserve">Repositório fluxid_integra2026 (21 tabelas do Supabase, nenhuma do lacre); código e tabelas da Oxide; documentos do projeto.</w:t>
+              <w:t xml:space="preserve">Repositório fluxid_integra2026 (tabelas do Supabase; nenhuma do lacre no repositório); repositório fluxid-firmware; código e tabelas da Oxide; respostas de 10/10/2026.</w:t>
             </w:r>
           </w:p>
         </w:tc>

</xml_diff>